<commit_message>
Point the site at IT support roles and fix review findings
- Hide the Freddo Index live link while its deployment 404s
- Reword the tagline, Projects intro and current timeline entry around IT
- Show the VantageUAV responsibilities without a toggle
- Rebuild Skills around the CV's key skills, dropping duplicates and "(Expert)"
- Show 4 or 5 tags per project instead of the full stack
- Correct the analyser's privacy wording: the cover letter step calls Anthropic
- Sticky View CV dock on phones, PDF fallback for browsers without a viewer
- Raise footer text contrast and drop "Remote Preferred" from location
- Fix typos and British spelling in the Word CV

Co-Authored-By: Claude Opus 5.5 <noreply@anthropic.com>
</commit_message>
<xml_diff>
--- a/public/Charlie_De_Buriatte_CV.docx
+++ b/public/Charlie_De_Buriatte_CV.docx
@@ -111,7 +111,7 @@
         <w:rPr>
           <w:rtl w:val="0"/>
         </w:rPr>
-        <w:t xml:space="preserve">Support professional with experience across IT helpdesk and customer service. Known for clear communication, patience, and strong problem solving, I enjoy helping people, fixing issues, and keeping things running smoothly. I handle technical problems with confidence, from basic networking and device setup to Windows troubleshooting, while giving customers a positive and reassuring experience. Quick to learn new tools and processes, organised in fast paced environments, and always looking for ways to improve how support is delivered. Passionate about AI technologies and committed to continuous learning in spare time to explore emerging tools and innovations in the field.</w:t>
+        <w:t xml:space="preserve">Support professional with experience across IT helpdesk and customer service. Known for clear communication, patience, and strong problem solving, I enjoy helping people, fixing issues, and keeping things running smoothly. I handle technical problems with confidence, from basic networking and device setup to Windows troubleshooting, while giving customers a positive and reassuring experience. Quick to learn new tools and processes, organised in fast-paced environments, and always looking for ways to improve how support is delivered. Passionate about AI technologies and committed to continuous learning in spare time to explore emerging tools and innovations in the field.</w:t>
       </w:r>
     </w:p>
     <w:p>
@@ -198,29 +198,29 @@
         <w:rPr>
           <w:rtl w:val="0"/>
         </w:rPr>
-        <w:t xml:space="preserve">- Built and maintained virtual labs for Windows Server, Windows 10/11 and Linux, Practicing troubleshooting, hardware fundamentals and networking through CompTIA A+ and Network+ exam preparation.  </w:t>
-      </w:r>
-    </w:p>
-    <w:p>
-      <w:pPr>
-        <w:rPr/>
-      </w:pPr>
-      <w:r>
-        <w:rPr>
-          <w:rtl w:val="0"/>
-        </w:rPr>
-        <w:t xml:space="preserve">- Provided informal remote IT support to friends and family, resolving issues with WIndows devices, home Wi-Fi, printers and software resulting in consistent positive feedback.</w:t>
-      </w:r>
-    </w:p>
-    <w:p>
-      <w:pPr>
-        <w:rPr/>
-      </w:pPr>
-      <w:r>
-        <w:rPr>
-          <w:rtl w:val="0"/>
-        </w:rPr>
-        <w:t xml:space="preserve">- Configured Active DIrectory Domain Services (AD DS) with DNS interrelating and Group Policies for password and account management in a Windows Server 2025 VM environment.</w:t>
+        <w:t xml:space="preserve">- Built and maintained virtual labs for Windows Server, Windows 10/11 and Linux, practising troubleshooting, hardware fundamentals and networking through CompTIA A+ and Network+ exam preparation.  </w:t>
+      </w:r>
+    </w:p>
+    <w:p>
+      <w:pPr>
+        <w:rPr/>
+      </w:pPr>
+      <w:r>
+        <w:rPr>
+          <w:rtl w:val="0"/>
+        </w:rPr>
+        <w:t xml:space="preserve">- Provided informal remote IT support to friends and family, resolving issues with Windows devices, home Wi-Fi, printers and software resulting in consistent positive feedback.</w:t>
+      </w:r>
+    </w:p>
+    <w:p>
+      <w:pPr>
+        <w:rPr/>
+      </w:pPr>
+      <w:r>
+        <w:rPr>
+          <w:rtl w:val="0"/>
+        </w:rPr>
+        <w:t xml:space="preserve">- Configured Active Directory Domain Services (AD DS) with DNS integration and Group Policies for password and account management in a Windows Server 2025 VM environment.</w:t>
       </w:r>
     </w:p>
     <w:p>
@@ -242,7 +242,7 @@
         <w:rPr>
           <w:rtl w:val="0"/>
         </w:rPr>
-        <w:t xml:space="preserve">- simulated service desk operations using Freshdesk, managing tickets from creating to closure, including prioritisation, internal notes and workflow optimisation.</w:t>
+        <w:t xml:space="preserve">- Simulated service desk operations using Freshdesk, managing tickets from creation to closure, including prioritisation, internal notes and workflow optimisation.</w:t>
       </w:r>
     </w:p>
     <w:p>
@@ -304,7 +304,7 @@
         <w:rPr>
           <w:rtl w:val="0"/>
         </w:rPr>
-        <w:t xml:space="preserve">- Managed inventory of laptops and peripherals, coordinating hardware swaps and replacements to minimize operational disruptions.</w:t>
+        <w:t xml:space="preserve">- Managed inventory of laptops and peripherals, coordinating hardware swaps and replacements to minimise operational disruptions.</w:t>
       </w:r>
     </w:p>
     <w:p>
@@ -333,7 +333,7 @@
         <w:rPr>
           <w:rtl w:val="0"/>
         </w:rPr>
-        <w:t xml:space="preserve">- Conducted high-volume structured phone interviews and survey, ensuring 100% data accuracy while building rapport with diverse respondents.</w:t>
+        <w:t xml:space="preserve">- Conducted high-volume structured phone interviews and surveys, ensuring 100% data accuracy while building rapport with diverse respondents.</w:t>
       </w:r>
     </w:p>
     <w:p>

</xml_diff>